<commit_message>
atualização na semana 10 de IA
</commit_message>
<xml_diff>
--- a/Inteligência Artificial/2-Bimestre/semana_10/Atividade de Registro semana 10 de IA.docx
+++ b/Inteligência Artificial/2-Bimestre/semana_10/Atividade de Registro semana 10 de IA.docx
@@ -76,23 +76,7 @@
                 <w:b/>
                 <w:bCs/>
               </w:rPr>
-              <w:t>Fine-</w:t>
-            </w:r>
-            <w:proofErr w:type="spellStart"/>
-            <w:r>
-              <w:rPr>
-                <w:b/>
-                <w:bCs/>
-              </w:rPr>
-              <w:t>tuning</w:t>
-            </w:r>
-            <w:proofErr w:type="spellEnd"/>
-            <w:r>
-              <w:rPr>
-                <w:b/>
-                <w:bCs/>
-              </w:rPr>
-              <w:t xml:space="preserve"> completo</w:t>
+              <w:t>Fine-tuning completo</w:t>
             </w:r>
           </w:p>
         </w:tc>
@@ -131,21 +115,12 @@
                 <w:bCs/>
               </w:rPr>
             </w:pPr>
-            <w:proofErr w:type="spellStart"/>
             <w:r>
               <w:rPr>
                 <w:b/>
                 <w:bCs/>
               </w:rPr>
-              <w:t>Embeddings</w:t>
-            </w:r>
-            <w:proofErr w:type="spellEnd"/>
-            <w:r>
-              <w:rPr>
-                <w:b/>
-                <w:bCs/>
-              </w:rPr>
-              <w:t xml:space="preserve"> customizados</w:t>
+              <w:t>Embeddings customizados</w:t>
             </w:r>
           </w:p>
         </w:tc>
@@ -202,15 +177,7 @@
           </w:tcPr>
           <w:p>
             <w:r>
-              <w:t xml:space="preserve">Médio (alguns dias para treinar </w:t>
-            </w:r>
-            <w:proofErr w:type="spellStart"/>
-            <w:r>
-              <w:t>embeddings</w:t>
-            </w:r>
-            <w:proofErr w:type="spellEnd"/>
-            <w:r>
-              <w:t>)</w:t>
+              <w:t>Médio (alguns dias para treinar embeddings)</w:t>
             </w:r>
           </w:p>
         </w:tc>
@@ -462,23 +429,7 @@
     </w:p>
     <w:p>
       <w:r>
-        <w:t>Todas, porém o Fine-</w:t>
-      </w:r>
-      <w:proofErr w:type="spellStart"/>
-      <w:r>
-        <w:t>tuning</w:t>
-      </w:r>
-      <w:proofErr w:type="spellEnd"/>
-      <w:r>
-        <w:t xml:space="preserve"> completo consumiria grande parte do orçamento, o Modelo pronto + prompts seria o mais barato e o </w:t>
-      </w:r>
-      <w:proofErr w:type="spellStart"/>
-      <w:r>
-        <w:t>Embeddings</w:t>
-      </w:r>
-      <w:proofErr w:type="spellEnd"/>
-      <w:r>
-        <w:t xml:space="preserve"> customizados teria custo intermediário</w:t>
+        <w:t>Todas, porém o Fine-tuning completo consumiria grande parte do orçamento, o Modelo pronto + prompts seria o mais barato e o Embeddings customizados teria custo intermediário</w:t>
       </w:r>
     </w:p>
     <w:p>
@@ -546,23 +497,7 @@
         </w:numPr>
       </w:pPr>
       <w:r>
-        <w:t xml:space="preserve">“A </w:t>
-      </w:r>
-      <w:proofErr w:type="spellStart"/>
-      <w:r>
-        <w:t>photo</w:t>
-      </w:r>
-      <w:proofErr w:type="spellEnd"/>
-      <w:r>
-        <w:t xml:space="preserve"> </w:t>
-      </w:r>
-      <w:proofErr w:type="spellStart"/>
-      <w:r>
-        <w:t>of</w:t>
-      </w:r>
-      <w:proofErr w:type="spellEnd"/>
-      <w:r>
-        <w:t xml:space="preserve"> a dog” </w:t>
+        <w:t xml:space="preserve">“A photo of a dog” </w:t>
       </w:r>
     </w:p>
     <w:p>
@@ -573,31 +508,7 @@
         </w:numPr>
       </w:pPr>
       <w:r>
-        <w:t xml:space="preserve">“A </w:t>
-      </w:r>
-      <w:proofErr w:type="spellStart"/>
-      <w:r>
-        <w:t>photo</w:t>
-      </w:r>
-      <w:proofErr w:type="spellEnd"/>
-      <w:r>
-        <w:t xml:space="preserve"> </w:t>
-      </w:r>
-      <w:proofErr w:type="spellStart"/>
-      <w:r>
-        <w:t>of</w:t>
-      </w:r>
-      <w:proofErr w:type="spellEnd"/>
-      <w:r>
-        <w:t xml:space="preserve"> a </w:t>
-      </w:r>
-      <w:proofErr w:type="spellStart"/>
-      <w:r>
-        <w:t>brown</w:t>
-      </w:r>
-      <w:proofErr w:type="spellEnd"/>
-      <w:r>
-        <w:t xml:space="preserve"> dog” </w:t>
+        <w:t xml:space="preserve">“A photo of a brown dog” </w:t>
       </w:r>
     </w:p>
     <w:p>
@@ -623,111 +534,7 @@
         </w:numPr>
       </w:pPr>
       <w:r>
-        <w:t xml:space="preserve">“A </w:t>
-      </w:r>
-      <w:proofErr w:type="spellStart"/>
-      <w:r>
-        <w:t>photo</w:t>
-      </w:r>
-      <w:proofErr w:type="spellEnd"/>
-      <w:r>
-        <w:t xml:space="preserve"> </w:t>
-      </w:r>
-      <w:proofErr w:type="spellStart"/>
-      <w:r>
-        <w:t>of</w:t>
-      </w:r>
-      <w:proofErr w:type="spellEnd"/>
-      <w:r>
-        <w:t xml:space="preserve"> Rex, a </w:t>
-      </w:r>
-      <w:proofErr w:type="spellStart"/>
-      <w:r>
-        <w:t>small</w:t>
-      </w:r>
-      <w:proofErr w:type="spellEnd"/>
-      <w:r>
-        <w:t xml:space="preserve"> </w:t>
-      </w:r>
-      <w:proofErr w:type="spellStart"/>
-      <w:r>
-        <w:t>brown</w:t>
-      </w:r>
-      <w:proofErr w:type="spellEnd"/>
-      <w:r>
-        <w:t xml:space="preserve"> dog </w:t>
-      </w:r>
-      <w:proofErr w:type="spellStart"/>
-      <w:r>
-        <w:t>with</w:t>
-      </w:r>
-      <w:proofErr w:type="spellEnd"/>
-      <w:r>
-        <w:t xml:space="preserve"> a blue </w:t>
-      </w:r>
-      <w:proofErr w:type="spellStart"/>
-      <w:r>
-        <w:t>collar</w:t>
-      </w:r>
-      <w:proofErr w:type="spellEnd"/>
-      <w:r>
-        <w:t xml:space="preserve"> </w:t>
-      </w:r>
-      <w:proofErr w:type="spellStart"/>
-      <w:r>
-        <w:t>that</w:t>
-      </w:r>
-      <w:proofErr w:type="spellEnd"/>
-      <w:r>
-        <w:t xml:space="preserve"> </w:t>
-      </w:r>
-      <w:proofErr w:type="spellStart"/>
-      <w:r>
-        <w:t>says</w:t>
-      </w:r>
-      <w:proofErr w:type="spellEnd"/>
-      <w:r>
-        <w:t xml:space="preserve"> ‘Rex’, </w:t>
-      </w:r>
-      <w:proofErr w:type="spellStart"/>
-      <w:r>
-        <w:t>sitting</w:t>
-      </w:r>
-      <w:proofErr w:type="spellEnd"/>
-      <w:r>
-        <w:t xml:space="preserve"> </w:t>
-      </w:r>
-      <w:proofErr w:type="spellStart"/>
-      <w:r>
-        <w:t>on</w:t>
-      </w:r>
-      <w:proofErr w:type="spellEnd"/>
-      <w:r>
-        <w:t xml:space="preserve"> a </w:t>
-      </w:r>
-      <w:proofErr w:type="spellStart"/>
-      <w:r>
-        <w:t>red</w:t>
-      </w:r>
-      <w:proofErr w:type="spellEnd"/>
-      <w:r>
-        <w:t xml:space="preserve"> </w:t>
-      </w:r>
-      <w:proofErr w:type="spellStart"/>
-      <w:r>
-        <w:t>sofa</w:t>
-      </w:r>
-      <w:proofErr w:type="spellEnd"/>
-      <w:r>
-        <w:t xml:space="preserve"> in a living </w:t>
-      </w:r>
-      <w:proofErr w:type="spellStart"/>
-      <w:r>
-        <w:t>room</w:t>
-      </w:r>
-      <w:proofErr w:type="spellEnd"/>
-      <w:r>
-        <w:t xml:space="preserve">” </w:t>
+        <w:t xml:space="preserve">“A photo of Rex, a small brown dog with a blue collar that says ‘Rex’, sitting on a red sofa in a living room” </w:t>
       </w:r>
     </w:p>
     <w:p>
@@ -752,70 +559,123 @@
           <w:numId w:val="3"/>
         </w:numPr>
       </w:pPr>
-      <w:proofErr w:type="spellStart"/>
       <w:r>
         <w:rPr>
           <w:b/>
           <w:bCs/>
         </w:rPr>
-        <w:t>Class</w:t>
-      </w:r>
-      <w:proofErr w:type="spellEnd"/>
+        <w:t>Class prompt:</w:t>
+      </w:r>
+      <w:r>
+        <w:br/>
+        <w:t xml:space="preserve">A IA manteve a imagem mais genérica, mostrando apenas um cachorro comum sem muitos detalhes específicos. </w:t>
+      </w:r>
+    </w:p>
+    <w:p>
+      <w:pPr>
+        <w:numPr>
+          <w:ilvl w:val="0"/>
+          <w:numId w:val="3"/>
+        </w:numPr>
+      </w:pPr>
       <w:r>
         <w:rPr>
           <w:b/>
           <w:bCs/>
         </w:rPr>
-        <w:t xml:space="preserve"> prompt:</w:t>
+        <w:t>Instance prompt:</w:t>
       </w:r>
       <w:r>
         <w:br/>
-        <w:t xml:space="preserve">A IA manteve a imagem mais genérica, mostrando apenas um cachorro comum sem muitos detalhes específicos. </w:t>
+        <w:t>A IA adicionou detalhes específicos, como o nome Rex, a coleira azul, o sofá vermelho e a sala de estar.</w:t>
+      </w:r>
+    </w:p>
+    <w:p/>
+    <w:p>
+      <w:r>
+        <w:t>Aula 3 - Registro</w:t>
       </w:r>
     </w:p>
     <w:p>
       <w:pPr>
-        <w:numPr>
-          <w:ilvl w:val="0"/>
-          <w:numId w:val="3"/>
-        </w:numPr>
-      </w:pPr>
-      <w:proofErr w:type="spellStart"/>
-      <w:r>
         <w:rPr>
           <w:b/>
           <w:bCs/>
         </w:rPr>
-        <w:t>Instance</w:t>
-      </w:r>
-      <w:proofErr w:type="spellEnd"/>
+      </w:pPr>
       <w:r>
         <w:rPr>
           <w:b/>
           <w:bCs/>
         </w:rPr>
-        <w:t xml:space="preserve"> prompt:</w:t>
-      </w:r>
-      <w:r>
-        <w:br/>
-        <w:t>A IA adicionou detalhes específicos, como o nome Rex, a coleira azul, o sofá vermelho e a sala de estar.</w:t>
+        <w:t>1. Quantas tentativas foram necessárias?</w:t>
       </w:r>
     </w:p>
     <w:p>
-      <w:pPr>
-        <w:ind w:left="360"/>
+      <w:r>
+        <w:t xml:space="preserve">Foram necessárias cerca de </w:t>
+      </w:r>
+      <w:r>
         <w:rPr>
           <w:b/>
           <w:bCs/>
         </w:rPr>
-      </w:pPr>
+        <w:t>4 a 6 tentativas</w:t>
+      </w:r>
+      <w:r>
+        <w:t xml:space="preserve"> até alcançar um resultado satisfatório.</w:t>
+      </w:r>
     </w:p>
     <w:p>
       <w:pPr>
-        <w:ind w:left="360"/>
-      </w:pPr>
+        <w:rPr>
+          <w:b/>
+          <w:bCs/>
+        </w:rPr>
+      </w:pPr>
+      <w:r>
+        <w:rPr>
+          <w:b/>
+          <w:bCs/>
+        </w:rPr>
+        <w:t>2. Como a cooperação influenciou o resultado?</w:t>
+      </w:r>
     </w:p>
-    <w:p/>
+    <w:p>
+      <w:r>
+        <w:t>Cada integrante ajudou com ideias diferentes. Um ajudou nos estilos artísticos, outro nos pesos e outro nos negative prompts. Quando houve opiniões diferentes, o grupo testou várias versões até decidir a melhor.</w:t>
+      </w:r>
+    </w:p>
+    <w:p>
+      <w:pPr>
+        <w:rPr>
+          <w:b/>
+          <w:bCs/>
+        </w:rPr>
+      </w:pPr>
+      <w:r>
+        <w:rPr>
+          <w:b/>
+          <w:bCs/>
+        </w:rPr>
+        <w:t>3. Diferença entre prompt weighting e negative prompts</w:t>
+      </w:r>
+    </w:p>
+    <w:p>
+      <w:pPr>
+        <w:rPr>
+          <w:b/>
+          <w:bCs/>
+        </w:rPr>
+      </w:pPr>
+      <w:r>
+        <w:rPr>
+          <w:b/>
+          <w:bCs/>
+        </w:rPr>
+        <w:t>Prompt weughting serve para dar mais importância a certos elementos da imagem e o negative prompt serve para remover coisas indesejadas da imagem.</w:t>
+      </w:r>
+    </w:p>
     <w:sectPr>
       <w:pgSz w:w="11906" w:h="16838"/>
       <w:pgMar w:top="1417" w:right="1701" w:bottom="1417" w:left="1701" w:header="708" w:footer="708" w:gutter="0"/>
@@ -1275,6 +1135,155 @@
       </w:rPr>
     </w:lvl>
   </w:abstractNum>
+  <w:abstractNum w:abstractNumId="3" w15:restartNumberingAfterBreak="0">
+    <w:nsid w:val="5ED02CBB"/>
+    <w:multiLevelType w:val="multilevel"/>
+    <w:tmpl w:val="6D8AA0F4"/>
+    <w:lvl w:ilvl="0">
+      <w:start w:val="1"/>
+      <w:numFmt w:val="bullet"/>
+      <w:lvlText w:val=""/>
+      <w:lvlJc w:val="left"/>
+      <w:pPr>
+        <w:tabs>
+          <w:tab w:val="num" w:pos="720"/>
+        </w:tabs>
+        <w:ind w:left="720" w:hanging="360"/>
+      </w:pPr>
+      <w:rPr>
+        <w:rFonts w:ascii="Symbol" w:hAnsi="Symbol" w:hint="default"/>
+        <w:sz w:val="20"/>
+      </w:rPr>
+    </w:lvl>
+    <w:lvl w:ilvl="1" w:tentative="1">
+      <w:start w:val="1"/>
+      <w:numFmt w:val="bullet"/>
+      <w:lvlText w:val="o"/>
+      <w:lvlJc w:val="left"/>
+      <w:pPr>
+        <w:tabs>
+          <w:tab w:val="num" w:pos="1440"/>
+        </w:tabs>
+        <w:ind w:left="1440" w:hanging="360"/>
+      </w:pPr>
+      <w:rPr>
+        <w:rFonts w:ascii="Courier New" w:hAnsi="Courier New" w:hint="default"/>
+        <w:sz w:val="20"/>
+      </w:rPr>
+    </w:lvl>
+    <w:lvl w:ilvl="2" w:tentative="1">
+      <w:start w:val="1"/>
+      <w:numFmt w:val="bullet"/>
+      <w:lvlText w:val=""/>
+      <w:lvlJc w:val="left"/>
+      <w:pPr>
+        <w:tabs>
+          <w:tab w:val="num" w:pos="2160"/>
+        </w:tabs>
+        <w:ind w:left="2160" w:hanging="360"/>
+      </w:pPr>
+      <w:rPr>
+        <w:rFonts w:ascii="Wingdings" w:hAnsi="Wingdings" w:hint="default"/>
+        <w:sz w:val="20"/>
+      </w:rPr>
+    </w:lvl>
+    <w:lvl w:ilvl="3" w:tentative="1">
+      <w:start w:val="1"/>
+      <w:numFmt w:val="bullet"/>
+      <w:lvlText w:val=""/>
+      <w:lvlJc w:val="left"/>
+      <w:pPr>
+        <w:tabs>
+          <w:tab w:val="num" w:pos="2880"/>
+        </w:tabs>
+        <w:ind w:left="2880" w:hanging="360"/>
+      </w:pPr>
+      <w:rPr>
+        <w:rFonts w:ascii="Wingdings" w:hAnsi="Wingdings" w:hint="default"/>
+        <w:sz w:val="20"/>
+      </w:rPr>
+    </w:lvl>
+    <w:lvl w:ilvl="4" w:tentative="1">
+      <w:start w:val="1"/>
+      <w:numFmt w:val="bullet"/>
+      <w:lvlText w:val=""/>
+      <w:lvlJc w:val="left"/>
+      <w:pPr>
+        <w:tabs>
+          <w:tab w:val="num" w:pos="3600"/>
+        </w:tabs>
+        <w:ind w:left="3600" w:hanging="360"/>
+      </w:pPr>
+      <w:rPr>
+        <w:rFonts w:ascii="Wingdings" w:hAnsi="Wingdings" w:hint="default"/>
+        <w:sz w:val="20"/>
+      </w:rPr>
+    </w:lvl>
+    <w:lvl w:ilvl="5" w:tentative="1">
+      <w:start w:val="1"/>
+      <w:numFmt w:val="bullet"/>
+      <w:lvlText w:val=""/>
+      <w:lvlJc w:val="left"/>
+      <w:pPr>
+        <w:tabs>
+          <w:tab w:val="num" w:pos="4320"/>
+        </w:tabs>
+        <w:ind w:left="4320" w:hanging="360"/>
+      </w:pPr>
+      <w:rPr>
+        <w:rFonts w:ascii="Wingdings" w:hAnsi="Wingdings" w:hint="default"/>
+        <w:sz w:val="20"/>
+      </w:rPr>
+    </w:lvl>
+    <w:lvl w:ilvl="6" w:tentative="1">
+      <w:start w:val="1"/>
+      <w:numFmt w:val="bullet"/>
+      <w:lvlText w:val=""/>
+      <w:lvlJc w:val="left"/>
+      <w:pPr>
+        <w:tabs>
+          <w:tab w:val="num" w:pos="5040"/>
+        </w:tabs>
+        <w:ind w:left="5040" w:hanging="360"/>
+      </w:pPr>
+      <w:rPr>
+        <w:rFonts w:ascii="Wingdings" w:hAnsi="Wingdings" w:hint="default"/>
+        <w:sz w:val="20"/>
+      </w:rPr>
+    </w:lvl>
+    <w:lvl w:ilvl="7" w:tentative="1">
+      <w:start w:val="1"/>
+      <w:numFmt w:val="bullet"/>
+      <w:lvlText w:val=""/>
+      <w:lvlJc w:val="left"/>
+      <w:pPr>
+        <w:tabs>
+          <w:tab w:val="num" w:pos="5760"/>
+        </w:tabs>
+        <w:ind w:left="5760" w:hanging="360"/>
+      </w:pPr>
+      <w:rPr>
+        <w:rFonts w:ascii="Wingdings" w:hAnsi="Wingdings" w:hint="default"/>
+        <w:sz w:val="20"/>
+      </w:rPr>
+    </w:lvl>
+    <w:lvl w:ilvl="8" w:tentative="1">
+      <w:start w:val="1"/>
+      <w:numFmt w:val="bullet"/>
+      <w:lvlText w:val=""/>
+      <w:lvlJc w:val="left"/>
+      <w:pPr>
+        <w:tabs>
+          <w:tab w:val="num" w:pos="6480"/>
+        </w:tabs>
+        <w:ind w:left="6480" w:hanging="360"/>
+      </w:pPr>
+      <w:rPr>
+        <w:rFonts w:ascii="Wingdings" w:hAnsi="Wingdings" w:hint="default"/>
+        <w:sz w:val="20"/>
+      </w:rPr>
+    </w:lvl>
+  </w:abstractNum>
   <w:num w:numId="1" w16cid:durableId="1258446440">
     <w:abstractNumId w:val="2"/>
   </w:num>
@@ -1283,6 +1292,9 @@
   </w:num>
   <w:num w:numId="3" w16cid:durableId="1939755316">
     <w:abstractNumId w:val="0"/>
+  </w:num>
+  <w:num w:numId="4" w16cid:durableId="199514215">
+    <w:abstractNumId w:val="3"/>
   </w:num>
 </w:numbering>
 </file>

</xml_diff>